<commit_message>
update group members list
</commit_message>
<xml_diff>
--- a/Project Documentation.docx
+++ b/Project Documentation.docx
@@ -224,23 +224,7 @@
             <w:sz w:val="40"/>
             <w:szCs w:val="40"/>
           </w:rPr>
-          <w:t>Planning and Considera</w:t>
-        </w:r>
-        <w:r>
-          <w:rPr>
-            <w:rStyle w:val="Hyperlink"/>
-            <w:sz w:val="40"/>
-            <w:szCs w:val="40"/>
-          </w:rPr>
-          <w:t>t</w:t>
-        </w:r>
-        <w:r>
-          <w:rPr>
-            <w:rStyle w:val="Hyperlink"/>
-            <w:sz w:val="40"/>
-            <w:szCs w:val="40"/>
-          </w:rPr>
-          <w:t>ions</w:t>
+          <w:t>Planning and Considerations</w:t>
         </w:r>
       </w:hyperlink>
     </w:p>
@@ -1174,6 +1158,22 @@
                 <w:szCs w:val="40"/>
               </w:rPr>
             </w:pPr>
+            <w:r>
+              <w:rPr>
+                <w:sz w:val="40"/>
+                <w:szCs w:val="40"/>
+              </w:rPr>
+              <w:t xml:space="preserve">Daniel </w:t>
+            </w:r>
+            <w:proofErr w:type="spellStart"/>
+            <w:r>
+              <w:rPr>
+                <w:sz w:val="40"/>
+                <w:szCs w:val="40"/>
+              </w:rPr>
+              <w:t>Ugwunwa</w:t>
+            </w:r>
+            <w:proofErr w:type="spellEnd"/>
           </w:p>
         </w:tc>
         <w:tc>
@@ -1190,6 +1190,13 @@
                 <w:szCs w:val="40"/>
               </w:rPr>
             </w:pPr>
+            <w:r>
+              <w:rPr>
+                <w:sz w:val="40"/>
+                <w:szCs w:val="40"/>
+              </w:rPr>
+              <w:t>30094567</w:t>
+            </w:r>
           </w:p>
         </w:tc>
         <w:tc>
@@ -1206,6 +1213,13 @@
                 <w:szCs w:val="40"/>
               </w:rPr>
             </w:pPr>
+            <w:r>
+              <w:rPr>
+                <w:sz w:val="40"/>
+                <w:szCs w:val="40"/>
+              </w:rPr>
+              <w:t>d.ugwunwa4567@miva.edu.ng</w:t>
+            </w:r>
           </w:p>
         </w:tc>
       </w:tr>
@@ -1227,6 +1241,31 @@
                 <w:szCs w:val="40"/>
               </w:rPr>
             </w:pPr>
+            <w:proofErr w:type="spellStart"/>
+            <w:r>
+              <w:rPr>
+                <w:sz w:val="40"/>
+                <w:szCs w:val="40"/>
+              </w:rPr>
+              <w:t>Folorunsho</w:t>
+            </w:r>
+            <w:proofErr w:type="spellEnd"/>
+            <w:r>
+              <w:rPr>
+                <w:sz w:val="40"/>
+                <w:szCs w:val="40"/>
+              </w:rPr>
+              <w:t xml:space="preserve"> </w:t>
+            </w:r>
+            <w:proofErr w:type="spellStart"/>
+            <w:r>
+              <w:rPr>
+                <w:sz w:val="40"/>
+                <w:szCs w:val="40"/>
+              </w:rPr>
+              <w:t>Oluwatobi</w:t>
+            </w:r>
+            <w:proofErr w:type="spellEnd"/>
           </w:p>
         </w:tc>
         <w:tc>
@@ -1243,6 +1282,13 @@
                 <w:szCs w:val="40"/>
               </w:rPr>
             </w:pPr>
+            <w:r>
+              <w:rPr>
+                <w:sz w:val="40"/>
+                <w:szCs w:val="40"/>
+              </w:rPr>
+              <w:t>30163916</w:t>
+            </w:r>
           </w:p>
         </w:tc>
         <w:tc>
@@ -1259,6 +1305,34 @@
                 <w:szCs w:val="40"/>
               </w:rPr>
             </w:pPr>
+            <w:r>
+              <w:rPr>
+                <w:sz w:val="40"/>
+                <w:szCs w:val="40"/>
+              </w:rPr>
+              <w:t>f</w:t>
+            </w:r>
+            <w:r>
+              <w:rPr>
+                <w:sz w:val="40"/>
+                <w:szCs w:val="40"/>
+              </w:rPr>
+              <w:t>olorunsho.</w:t>
+            </w:r>
+            <w:r>
+              <w:rPr>
+                <w:sz w:val="40"/>
+                <w:szCs w:val="40"/>
+              </w:rPr>
+              <w:t>o</w:t>
+            </w:r>
+            <w:r>
+              <w:rPr>
+                <w:sz w:val="40"/>
+                <w:szCs w:val="40"/>
+              </w:rPr>
+              <w:t>luwatobi@miva.edu.ng</w:t>
+            </w:r>
           </w:p>
         </w:tc>
       </w:tr>
@@ -37042,7 +37116,6 @@
   <w:style w:type="character" w:default="1" w:styleId="DefaultParagraphFont">
     <w:name w:val="Default Paragraph Font"/>
     <w:uiPriority w:val="1"/>
-    <w:semiHidden/>
     <w:unhideWhenUsed/>
   </w:style>
   <w:style w:type="table" w:default="1" w:styleId="TableNormal">

</xml_diff>